<commit_message>
Describe KiteWeb as an unofficial client and drop cost-avoidance wording
</commit_message>
<xml_diff>
--- a/resume/Vikas-Sharma-Python-Developer.docx
+++ b/resume/Vikas-Sharma-Python-Developer.docx
@@ -856,7 +856,7 @@
           <w:sz w:val="20"/>
           <w:szCs w:val="20"/>
         </w:rPr>
-        <w:t>KiteWeb (formerly APICostFree-Zerodha-Trade)</w:t>
+        <w:t>KiteWeb</w:t>
       </w:r>
       <w:r>
         <w:rPr>
@@ -875,7 +875,7 @@
           <w:sz w:val="20"/>
           <w:szCs w:val="20"/>
         </w:rPr>
-        <w:t xml:space="preserve"> - Python REST wrapper implementing authentication, session management, and order/market-data endpoints for a retail broker; used across the Indian algorithmic-trading community.</w:t>
+        <w:t xml:space="preserve"> - Unofficial Python client for Zerodha Kite web endpoints: authentication, session management, and order and market-data calls; adopted across the Indian retail algorithmic-trading community.</w:t>
       </w:r>
     </w:p>
     <w:p>

</xml_diff>